<commit_message>
Resolve image/reference issue set and close issue regressions
- Fix Word COM export for inline and floating image corpus docs
- Include DOTX in visual regression discovery and remove resolved known-gap entries
- Add permanent issue regression tests for inline/floating/panoramic page counts
- Improve paragraph pagination baseline and section-break propagation handling
- Update known-issues and phase-8 plan status
- Regenerate corpus docs and reference PNGs for image documents
</commit_message>
<xml_diff>
--- a/PanoramicData.Render.Test/test-assets/docx/floating-images.docx
+++ b/PanoramicData.Render.Test/test-assets/docx/floating-images.docx
@@ -19,10 +19,11 @@
               <wp:posOffset>914400</wp:posOffset>
             </wp:positionV>
             <wp:extent cx="1200000" cy="800000"/>
-            <wp:effectExtent/>
             <wp:wrapSquare wrapText="bothSides"/>
             <wp:docPr id="2" name="FloatingImage"/>
-            <wp:cNvGraphicFramePr/>
+            <wp:cNvGraphicFramePr>
+              <a:graphicFrameLocks xmlns:a="http://schemas.openxmlformats.org/drawingml/2006/main" noChangeAspect="1"/>
+            </wp:cNvGraphicFramePr>
             <a:graphic xmlns:a="http://schemas.openxmlformats.org/drawingml/2006/main">
               <a:graphicData uri="http://schemas.openxmlformats.org/drawingml/2006/picture">
                 <pic:pic xmlns:pic="http://schemas.openxmlformats.org/drawingml/2006/picture">
@@ -31,7 +32,7 @@
                     <pic:cNvPicPr/>
                   </pic:nvPicPr>
                   <pic:blipFill>
-                    <a:blip xmlns:r="http://schemas.openxmlformats.org/officeDocument/2006/relationships" r:embed="R3a52e015d6f14642"/>
+                    <a:blip xmlns:r="http://schemas.openxmlformats.org/officeDocument/2006/relationships" r:embed="Ra9bee651d5d94926"/>
                     <a:stretch>
                       <a:fillRect/>
                     </a:stretch>

</xml_diff>